<commit_message>
Add answers to figure version and append figure-less version
Co-Authored-By: Claude Sonnet 5.5 <noreply@anthropic.com>
Claude-Session: https://claude.ai/code/session_01NWqM3V7aFwEEd31dwpfsy5
</commit_message>
<xml_diff>
--- a/まなブリッジ算数_ストックリーディング.docx
+++ b/まなブリッジ算数_ストックリーディング.docx
@@ -20,7 +20,7 @@
           <w:sz w:val="28"/>
           <w:szCs w:val="28"/>
         </w:rPr>
-        <w:t xml:space="preserve">まなブリッジ算数 ストックリーディング　No.1</w:t>
+        <w:t xml:space="preserve">まなブリッジ算数 ストックリーディング　No.1　【解答】</w:t>
       </w:r>
       <w:r>
         <w:rPr>
@@ -28,7 +28,7 @@
           <w:sz w:val="22"/>
           <w:szCs w:val="22"/>
         </w:rPr>
-        <w:t xml:space="preserve">	なまえ＿＿＿＿＿＿＿</w:t>
+        <w:t xml:space="preserve"/>
       </w:r>
     </w:p>
     <w:tbl>
@@ -145,7 +145,18 @@
                 <w:sz w:val="26"/>
                 <w:szCs w:val="26"/>
               </w:rPr>
-              <w:t xml:space="preserve">（しき）</w:t>
+              <w:t xml:space="preserve">（しき）　</w:t>
+            </w:r>
+            <w:r>
+              <w:rPr>
+                <w:rFonts w:ascii="Arial" w:eastAsia="游ゴシック" w:hint="eastAsia"/>
+                <w:b/>
+                <w:bCs/>
+                <w:color w:val="D00000"/>
+                <w:sz w:val="28"/>
+                <w:szCs w:val="28"/>
+              </w:rPr>
+              <w:t xml:space="preserve">3＋1＋4＝8</w:t>
             </w:r>
           </w:p>
           <w:p>
@@ -159,15 +170,28 @@
                 <w:sz w:val="26"/>
                 <w:szCs w:val="26"/>
               </w:rPr>
-              <w:t xml:space="preserve">こたえ</w:t>
-            </w:r>
-            <w:r>
-              <w:rPr>
-                <w:rFonts w:ascii="Arial" w:eastAsia="游ゴシック" w:hint="eastAsia"/>
-                <w:sz w:val="26"/>
-                <w:szCs w:val="26"/>
-              </w:rPr>
-              <w:t xml:space="preserve">＿＿＿＿＿＿＿＿＿＿＿</w:t>
+              <w:t xml:space="preserve">こたえ　</w:t>
+            </w:r>
+            <w:r>
+              <w:rPr>
+                <w:rFonts w:ascii="Arial" w:eastAsia="游ゴシック" w:hint="eastAsia"/>
+                <w:b/>
+                <w:bCs/>
+                <w:color w:val="D00000"/>
+                <w:sz w:val="30"/>
+                <w:szCs w:val="30"/>
+                <w:u w:val="single"/>
+              </w:rPr>
+              <w:t xml:space="preserve">8にん</w:t>
+            </w:r>
+            <w:r>
+              <w:rPr>
+                <w:rFonts w:ascii="Arial" w:eastAsia="游ゴシック" w:hint="eastAsia"/>
+                <w:sz w:val="26"/>
+                <w:szCs w:val="26"/>
+                <w:u w:val="single"/>
+              </w:rPr>
+              <w:t xml:space="preserve">　　</w:t>
             </w:r>
           </w:p>
         </w:tc>
@@ -292,7 +316,18 @@
                 <w:sz w:val="26"/>
                 <w:szCs w:val="26"/>
               </w:rPr>
-              <w:t xml:space="preserve">（しき）</w:t>
+              <w:t xml:space="preserve">（しき）　</w:t>
+            </w:r>
+            <w:r>
+              <w:rPr>
+                <w:rFonts w:ascii="Arial" w:eastAsia="游ゴシック" w:hint="eastAsia"/>
+                <w:b/>
+                <w:bCs/>
+                <w:color w:val="D00000"/>
+                <w:sz w:val="28"/>
+                <w:szCs w:val="28"/>
+              </w:rPr>
+              <w:t xml:space="preserve">4＋1＋3＝8</w:t>
             </w:r>
           </w:p>
           <w:p>
@@ -306,15 +341,28 @@
                 <w:sz w:val="26"/>
                 <w:szCs w:val="26"/>
               </w:rPr>
-              <w:t xml:space="preserve">こたえ</w:t>
-            </w:r>
-            <w:r>
-              <w:rPr>
-                <w:rFonts w:ascii="Arial" w:eastAsia="游ゴシック" w:hint="eastAsia"/>
-                <w:sz w:val="26"/>
-                <w:szCs w:val="26"/>
-              </w:rPr>
-              <w:t xml:space="preserve">＿＿＿＿＿＿＿＿＿＿＿</w:t>
+              <w:t xml:space="preserve">こたえ　</w:t>
+            </w:r>
+            <w:r>
+              <w:rPr>
+                <w:rFonts w:ascii="Arial" w:eastAsia="游ゴシック" w:hint="eastAsia"/>
+                <w:b/>
+                <w:bCs/>
+                <w:color w:val="D00000"/>
+                <w:sz w:val="30"/>
+                <w:szCs w:val="30"/>
+                <w:u w:val="single"/>
+              </w:rPr>
+              <w:t xml:space="preserve">8にん</w:t>
+            </w:r>
+            <w:r>
+              <w:rPr>
+                <w:rFonts w:ascii="Arial" w:eastAsia="游ゴシック" w:hint="eastAsia"/>
+                <w:sz w:val="26"/>
+                <w:szCs w:val="26"/>
+                <w:u w:val="single"/>
+              </w:rPr>
+              <w:t xml:space="preserve">　　</w:t>
             </w:r>
           </w:p>
         </w:tc>
@@ -346,7 +394,7 @@
           <w:sz w:val="28"/>
           <w:szCs w:val="28"/>
         </w:rPr>
-        <w:t xml:space="preserve">まなブリッジ算数 ストックリーディング　No.2</w:t>
+        <w:t xml:space="preserve">まなブリッジ算数 ストックリーディング　No.2　【解答】</w:t>
       </w:r>
       <w:r>
         <w:rPr>
@@ -354,7 +402,7 @@
           <w:sz w:val="22"/>
           <w:szCs w:val="22"/>
         </w:rPr>
-        <w:t xml:space="preserve">	なまえ＿＿＿＿＿＿＿</w:t>
+        <w:t xml:space="preserve"/>
       </w:r>
     </w:p>
     <w:tbl>
@@ -471,7 +519,18 @@
                 <w:sz w:val="26"/>
                 <w:szCs w:val="26"/>
               </w:rPr>
-              <w:t xml:space="preserve">（しき）</w:t>
+              <w:t xml:space="preserve">（しき）　</w:t>
+            </w:r>
+            <w:r>
+              <w:rPr>
+                <w:rFonts w:ascii="Arial" w:eastAsia="游ゴシック" w:hint="eastAsia"/>
+                <w:b/>
+                <w:bCs/>
+                <w:color w:val="D00000"/>
+                <w:sz w:val="28"/>
+                <w:szCs w:val="28"/>
+              </w:rPr>
+              <w:t xml:space="preserve">4＋1＋4＝9</w:t>
             </w:r>
           </w:p>
           <w:p>
@@ -485,15 +544,28 @@
                 <w:sz w:val="26"/>
                 <w:szCs w:val="26"/>
               </w:rPr>
-              <w:t xml:space="preserve">こたえ</w:t>
-            </w:r>
-            <w:r>
-              <w:rPr>
-                <w:rFonts w:ascii="Arial" w:eastAsia="游ゴシック" w:hint="eastAsia"/>
-                <w:sz w:val="26"/>
-                <w:szCs w:val="26"/>
-              </w:rPr>
-              <w:t xml:space="preserve">＿＿＿＿＿＿＿＿＿＿＿</w:t>
+              <w:t xml:space="preserve">こたえ　</w:t>
+            </w:r>
+            <w:r>
+              <w:rPr>
+                <w:rFonts w:ascii="Arial" w:eastAsia="游ゴシック" w:hint="eastAsia"/>
+                <w:b/>
+                <w:bCs/>
+                <w:color w:val="D00000"/>
+                <w:sz w:val="30"/>
+                <w:szCs w:val="30"/>
+                <w:u w:val="single"/>
+              </w:rPr>
+              <w:t xml:space="preserve">9にん</w:t>
+            </w:r>
+            <w:r>
+              <w:rPr>
+                <w:rFonts w:ascii="Arial" w:eastAsia="游ゴシック" w:hint="eastAsia"/>
+                <w:sz w:val="26"/>
+                <w:szCs w:val="26"/>
+                <w:u w:val="single"/>
+              </w:rPr>
+              <w:t xml:space="preserve">　　</w:t>
             </w:r>
           </w:p>
         </w:tc>
@@ -618,7 +690,18 @@
                 <w:sz w:val="26"/>
                 <w:szCs w:val="26"/>
               </w:rPr>
-              <w:t xml:space="preserve">（しき）</w:t>
+              <w:t xml:space="preserve">（しき）　</w:t>
+            </w:r>
+            <w:r>
+              <w:rPr>
+                <w:rFonts w:ascii="Arial" w:eastAsia="游ゴシック" w:hint="eastAsia"/>
+                <w:b/>
+                <w:bCs/>
+                <w:color w:val="D00000"/>
+                <w:sz w:val="28"/>
+                <w:szCs w:val="28"/>
+              </w:rPr>
+              <w:t xml:space="preserve">6＋1＋4＝11</w:t>
             </w:r>
           </w:p>
           <w:p>
@@ -632,15 +715,28 @@
                 <w:sz w:val="26"/>
                 <w:szCs w:val="26"/>
               </w:rPr>
-              <w:t xml:space="preserve">こたえ</w:t>
-            </w:r>
-            <w:r>
-              <w:rPr>
-                <w:rFonts w:ascii="Arial" w:eastAsia="游ゴシック" w:hint="eastAsia"/>
-                <w:sz w:val="26"/>
-                <w:szCs w:val="26"/>
-              </w:rPr>
-              <w:t xml:space="preserve">＿＿＿＿＿＿＿＿＿＿＿</w:t>
+              <w:t xml:space="preserve">こたえ　</w:t>
+            </w:r>
+            <w:r>
+              <w:rPr>
+                <w:rFonts w:ascii="Arial" w:eastAsia="游ゴシック" w:hint="eastAsia"/>
+                <w:b/>
+                <w:bCs/>
+                <w:color w:val="D00000"/>
+                <w:sz w:val="30"/>
+                <w:szCs w:val="30"/>
+                <w:u w:val="single"/>
+              </w:rPr>
+              <w:t xml:space="preserve">11こ</w:t>
+            </w:r>
+            <w:r>
+              <w:rPr>
+                <w:rFonts w:ascii="Arial" w:eastAsia="游ゴシック" w:hint="eastAsia"/>
+                <w:sz w:val="26"/>
+                <w:szCs w:val="26"/>
+                <w:u w:val="single"/>
+              </w:rPr>
+              <w:t xml:space="preserve">　　</w:t>
             </w:r>
           </w:p>
         </w:tc>
@@ -672,7 +768,7 @@
           <w:sz w:val="28"/>
           <w:szCs w:val="28"/>
         </w:rPr>
-        <w:t xml:space="preserve">まなブリッジ算数 ストックリーディング　No.3</w:t>
+        <w:t xml:space="preserve">まなブリッジ算数 ストックリーディング　No.3　【解答】</w:t>
       </w:r>
       <w:r>
         <w:rPr>
@@ -680,7 +776,7 @@
           <w:sz w:val="22"/>
           <w:szCs w:val="22"/>
         </w:rPr>
-        <w:t xml:space="preserve">	なまえ＿＿＿＿＿＿＿</w:t>
+        <w:t xml:space="preserve"/>
       </w:r>
     </w:p>
     <w:tbl>
@@ -797,7 +893,18 @@
                 <w:sz w:val="26"/>
                 <w:szCs w:val="26"/>
               </w:rPr>
-              <w:t xml:space="preserve">（しき）</w:t>
+              <w:t xml:space="preserve">（しき）　</w:t>
+            </w:r>
+            <w:r>
+              <w:rPr>
+                <w:rFonts w:ascii="Arial" w:eastAsia="游ゴシック" w:hint="eastAsia"/>
+                <w:b/>
+                <w:bCs/>
+                <w:color w:val="D00000"/>
+                <w:sz w:val="28"/>
+                <w:szCs w:val="28"/>
+              </w:rPr>
+              <w:t xml:space="preserve">4＋1＋5＝10</w:t>
             </w:r>
           </w:p>
           <w:p>
@@ -811,15 +918,28 @@
                 <w:sz w:val="26"/>
                 <w:szCs w:val="26"/>
               </w:rPr>
-              <w:t xml:space="preserve">こたえ</w:t>
-            </w:r>
-            <w:r>
-              <w:rPr>
-                <w:rFonts w:ascii="Arial" w:eastAsia="游ゴシック" w:hint="eastAsia"/>
-                <w:sz w:val="26"/>
-                <w:szCs w:val="26"/>
-              </w:rPr>
-              <w:t xml:space="preserve">＿＿＿＿＿＿＿＿＿＿＿</w:t>
+              <w:t xml:space="preserve">こたえ　</w:t>
+            </w:r>
+            <w:r>
+              <w:rPr>
+                <w:rFonts w:ascii="Arial" w:eastAsia="游ゴシック" w:hint="eastAsia"/>
+                <w:b/>
+                <w:bCs/>
+                <w:color w:val="D00000"/>
+                <w:sz w:val="30"/>
+                <w:szCs w:val="30"/>
+                <w:u w:val="single"/>
+              </w:rPr>
+              <w:t xml:space="preserve">10だい</w:t>
+            </w:r>
+            <w:r>
+              <w:rPr>
+                <w:rFonts w:ascii="Arial" w:eastAsia="游ゴシック" w:hint="eastAsia"/>
+                <w:sz w:val="26"/>
+                <w:szCs w:val="26"/>
+                <w:u w:val="single"/>
+              </w:rPr>
+              <w:t xml:space="preserve">　　</w:t>
             </w:r>
           </w:p>
         </w:tc>
@@ -944,7 +1064,18 @@
                 <w:sz w:val="26"/>
                 <w:szCs w:val="26"/>
               </w:rPr>
-              <w:t xml:space="preserve">（しき）</w:t>
+              <w:t xml:space="preserve">（しき）　</w:t>
+            </w:r>
+            <w:r>
+              <w:rPr>
+                <w:rFonts w:ascii="Arial" w:eastAsia="游ゴシック" w:hint="eastAsia"/>
+                <w:b/>
+                <w:bCs/>
+                <w:color w:val="D00000"/>
+                <w:sz w:val="28"/>
+                <w:szCs w:val="28"/>
+              </w:rPr>
+              <w:t xml:space="preserve">5＋1＋5＝11</w:t>
             </w:r>
           </w:p>
           <w:p>
@@ -958,15 +1089,28 @@
                 <w:sz w:val="26"/>
                 <w:szCs w:val="26"/>
               </w:rPr>
-              <w:t xml:space="preserve">こたえ</w:t>
-            </w:r>
-            <w:r>
-              <w:rPr>
-                <w:rFonts w:ascii="Arial" w:eastAsia="游ゴシック" w:hint="eastAsia"/>
-                <w:sz w:val="26"/>
-                <w:szCs w:val="26"/>
-              </w:rPr>
-              <w:t xml:space="preserve">＿＿＿＿＿＿＿＿＿＿＿</w:t>
+              <w:t xml:space="preserve">こたえ　</w:t>
+            </w:r>
+            <w:r>
+              <w:rPr>
+                <w:rFonts w:ascii="Arial" w:eastAsia="游ゴシック" w:hint="eastAsia"/>
+                <w:b/>
+                <w:bCs/>
+                <w:color w:val="D00000"/>
+                <w:sz w:val="30"/>
+                <w:szCs w:val="30"/>
+                <w:u w:val="single"/>
+              </w:rPr>
+              <w:t xml:space="preserve">11にん</w:t>
+            </w:r>
+            <w:r>
+              <w:rPr>
+                <w:rFonts w:ascii="Arial" w:eastAsia="游ゴシック" w:hint="eastAsia"/>
+                <w:sz w:val="26"/>
+                <w:szCs w:val="26"/>
+                <w:u w:val="single"/>
+              </w:rPr>
+              <w:t xml:space="preserve">　　</w:t>
             </w:r>
           </w:p>
         </w:tc>
@@ -998,7 +1142,7 @@
           <w:sz w:val="28"/>
           <w:szCs w:val="28"/>
         </w:rPr>
-        <w:t xml:space="preserve">まなブリッジ算数 ストックリーディング　No.4</w:t>
+        <w:t xml:space="preserve">まなブリッジ算数 ストックリーディング　No.4　【解答】</w:t>
       </w:r>
       <w:r>
         <w:rPr>
@@ -1006,7 +1150,7 @@
           <w:sz w:val="22"/>
           <w:szCs w:val="22"/>
         </w:rPr>
-        <w:t xml:space="preserve">	なまえ＿＿＿＿＿＿＿</w:t>
+        <w:t xml:space="preserve"/>
       </w:r>
     </w:p>
     <w:tbl>
@@ -1123,7 +1267,18 @@
                 <w:sz w:val="26"/>
                 <w:szCs w:val="26"/>
               </w:rPr>
-              <w:t xml:space="preserve">（しき）</w:t>
+              <w:t xml:space="preserve">（しき）　</w:t>
+            </w:r>
+            <w:r>
+              <w:rPr>
+                <w:rFonts w:ascii="Arial" w:eastAsia="游ゴシック" w:hint="eastAsia"/>
+                <w:b/>
+                <w:bCs/>
+                <w:color w:val="D00000"/>
+                <w:sz w:val="28"/>
+                <w:szCs w:val="28"/>
+              </w:rPr>
+              <w:t xml:space="preserve">6－4＋2＝4</w:t>
             </w:r>
           </w:p>
           <w:p>
@@ -1137,15 +1292,28 @@
                 <w:sz w:val="26"/>
                 <w:szCs w:val="26"/>
               </w:rPr>
-              <w:t xml:space="preserve">こたえ</w:t>
-            </w:r>
-            <w:r>
-              <w:rPr>
-                <w:rFonts w:ascii="Arial" w:eastAsia="游ゴシック" w:hint="eastAsia"/>
-                <w:sz w:val="26"/>
-                <w:szCs w:val="26"/>
-              </w:rPr>
-              <w:t xml:space="preserve">＿＿＿＿＿＿＿＿＿＿＿</w:t>
+              <w:t xml:space="preserve">こたえ　</w:t>
+            </w:r>
+            <w:r>
+              <w:rPr>
+                <w:rFonts w:ascii="Arial" w:eastAsia="游ゴシック" w:hint="eastAsia"/>
+                <w:b/>
+                <w:bCs/>
+                <w:color w:val="D00000"/>
+                <w:sz w:val="30"/>
+                <w:szCs w:val="30"/>
+                <w:u w:val="single"/>
+              </w:rPr>
+              <w:t xml:space="preserve">4にん</w:t>
+            </w:r>
+            <w:r>
+              <w:rPr>
+                <w:rFonts w:ascii="Arial" w:eastAsia="游ゴシック" w:hint="eastAsia"/>
+                <w:sz w:val="26"/>
+                <w:szCs w:val="26"/>
+                <w:u w:val="single"/>
+              </w:rPr>
+              <w:t xml:space="preserve">　　</w:t>
             </w:r>
           </w:p>
         </w:tc>
@@ -1270,7 +1438,18 @@
                 <w:sz w:val="26"/>
                 <w:szCs w:val="26"/>
               </w:rPr>
-              <w:t xml:space="preserve">（しき）</w:t>
+              <w:t xml:space="preserve">（しき）　</w:t>
+            </w:r>
+            <w:r>
+              <w:rPr>
+                <w:rFonts w:ascii="Arial" w:eastAsia="游ゴシック" w:hint="eastAsia"/>
+                <w:b/>
+                <w:bCs/>
+                <w:color w:val="D00000"/>
+                <w:sz w:val="28"/>
+                <w:szCs w:val="28"/>
+              </w:rPr>
+              <w:t xml:space="preserve">8－7＋3＋2＝6</w:t>
             </w:r>
           </w:p>
           <w:p>
@@ -1284,15 +1463,28 @@
                 <w:sz w:val="26"/>
                 <w:szCs w:val="26"/>
               </w:rPr>
-              <w:t xml:space="preserve">こたえ</w:t>
-            </w:r>
-            <w:r>
-              <w:rPr>
-                <w:rFonts w:ascii="Arial" w:eastAsia="游ゴシック" w:hint="eastAsia"/>
-                <w:sz w:val="26"/>
-                <w:szCs w:val="26"/>
-              </w:rPr>
-              <w:t xml:space="preserve">＿＿＿＿＿＿＿＿＿＿＿</w:t>
+              <w:t xml:space="preserve">こたえ　</w:t>
+            </w:r>
+            <w:r>
+              <w:rPr>
+                <w:rFonts w:ascii="Arial" w:eastAsia="游ゴシック" w:hint="eastAsia"/>
+                <w:b/>
+                <w:bCs/>
+                <w:color w:val="D00000"/>
+                <w:sz w:val="30"/>
+                <w:szCs w:val="30"/>
+                <w:u w:val="single"/>
+              </w:rPr>
+              <w:t xml:space="preserve">6ぽん</w:t>
+            </w:r>
+            <w:r>
+              <w:rPr>
+                <w:rFonts w:ascii="Arial" w:eastAsia="游ゴシック" w:hint="eastAsia"/>
+                <w:sz w:val="26"/>
+                <w:szCs w:val="26"/>
+                <w:u w:val="single"/>
+              </w:rPr>
+              <w:t xml:space="preserve">　　</w:t>
             </w:r>
           </w:p>
         </w:tc>
@@ -1324,7 +1516,7 @@
           <w:sz w:val="28"/>
           <w:szCs w:val="28"/>
         </w:rPr>
-        <w:t xml:space="preserve">まなブリッジ算数 ストックリーディング　No.5</w:t>
+        <w:t xml:space="preserve">まなブリッジ算数 ストックリーディング　No.5　【解答】</w:t>
       </w:r>
       <w:r>
         <w:rPr>
@@ -1332,7 +1524,7 @@
           <w:sz w:val="22"/>
           <w:szCs w:val="22"/>
         </w:rPr>
-        <w:t xml:space="preserve">	なまえ＿＿＿＿＿＿＿</w:t>
+        <w:t xml:space="preserve"/>
       </w:r>
     </w:p>
     <w:tbl>
@@ -1449,7 +1641,18 @@
                 <w:sz w:val="26"/>
                 <w:szCs w:val="26"/>
               </w:rPr>
-              <w:t xml:space="preserve">（しき）</w:t>
+              <w:t xml:space="preserve">（しき）　</w:t>
+            </w:r>
+            <w:r>
+              <w:rPr>
+                <w:rFonts w:ascii="Arial" w:eastAsia="游ゴシック" w:hint="eastAsia"/>
+                <w:b/>
+                <w:bCs/>
+                <w:color w:val="D00000"/>
+                <w:sz w:val="28"/>
+                <w:szCs w:val="28"/>
+              </w:rPr>
+              <w:t xml:space="preserve">8－6＝2</w:t>
             </w:r>
           </w:p>
           <w:p>
@@ -1463,15 +1666,28 @@
                 <w:sz w:val="26"/>
                 <w:szCs w:val="26"/>
               </w:rPr>
-              <w:t xml:space="preserve">こたえ</w:t>
-            </w:r>
-            <w:r>
-              <w:rPr>
-                <w:rFonts w:ascii="Arial" w:eastAsia="游ゴシック" w:hint="eastAsia"/>
-                <w:sz w:val="26"/>
-                <w:szCs w:val="26"/>
-              </w:rPr>
-              <w:t xml:space="preserve">＿＿＿＿＿＿＿＿＿＿＿</w:t>
+              <w:t xml:space="preserve">こたえ　</w:t>
+            </w:r>
+            <w:r>
+              <w:rPr>
+                <w:rFonts w:ascii="Arial" w:eastAsia="游ゴシック" w:hint="eastAsia"/>
+                <w:b/>
+                <w:bCs/>
+                <w:color w:val="D00000"/>
+                <w:sz w:val="30"/>
+                <w:szCs w:val="30"/>
+                <w:u w:val="single"/>
+              </w:rPr>
+              <w:t xml:space="preserve">2こ</w:t>
+            </w:r>
+            <w:r>
+              <w:rPr>
+                <w:rFonts w:ascii="Arial" w:eastAsia="游ゴシック" w:hint="eastAsia"/>
+                <w:sz w:val="26"/>
+                <w:szCs w:val="26"/>
+                <w:u w:val="single"/>
+              </w:rPr>
+              <w:t xml:space="preserve">　　</w:t>
             </w:r>
           </w:p>
         </w:tc>
@@ -1584,6 +1800,1330 @@
                   </a:graphic>
                 </wp:inline>
               </w:drawing>
+            </w:r>
+          </w:p>
+          <w:p>
+            <w:pPr>
+              <w:spacing w:after="200" w:before="200"/>
+            </w:pPr>
+            <w:r>
+              <w:rPr>
+                <w:rFonts w:ascii="Arial" w:eastAsia="游ゴシック" w:hint="eastAsia"/>
+                <w:sz w:val="26"/>
+                <w:szCs w:val="26"/>
+              </w:rPr>
+              <w:t xml:space="preserve">（しき）　</w:t>
+            </w:r>
+            <w:r>
+              <w:rPr>
+                <w:rFonts w:ascii="Arial" w:eastAsia="游ゴシック" w:hint="eastAsia"/>
+                <w:b/>
+                <w:bCs/>
+                <w:color w:val="D00000"/>
+                <w:sz w:val="28"/>
+                <w:szCs w:val="28"/>
+              </w:rPr>
+              <w:t xml:space="preserve">9－2＝7</w:t>
+            </w:r>
+          </w:p>
+          <w:p>
+            <w:pPr>
+              <w:spacing w:before="300"/>
+              <w:jc w:val="right"/>
+            </w:pPr>
+            <w:r>
+              <w:rPr>
+                <w:rFonts w:ascii="Arial" w:eastAsia="游ゴシック" w:hint="eastAsia"/>
+                <w:sz w:val="26"/>
+                <w:szCs w:val="26"/>
+              </w:rPr>
+              <w:t xml:space="preserve">こたえ　</w:t>
+            </w:r>
+            <w:r>
+              <w:rPr>
+                <w:rFonts w:ascii="Arial" w:eastAsia="游ゴシック" w:hint="eastAsia"/>
+                <w:b/>
+                <w:bCs/>
+                <w:color w:val="D00000"/>
+                <w:sz w:val="30"/>
+                <w:szCs w:val="30"/>
+                <w:u w:val="single"/>
+              </w:rPr>
+              <w:t xml:space="preserve">7にん</w:t>
+            </w:r>
+            <w:r>
+              <w:rPr>
+                <w:rFonts w:ascii="Arial" w:eastAsia="游ゴシック" w:hint="eastAsia"/>
+                <w:sz w:val="26"/>
+                <w:szCs w:val="26"/>
+                <w:u w:val="single"/>
+              </w:rPr>
+              <w:t xml:space="preserve">　　</w:t>
+            </w:r>
+          </w:p>
+        </w:tc>
+      </w:tr>
+    </w:tbl>
+    <w:p>
+      <w:pPr>
+        <w:spacing w:after="0" w:line="20"/>
+      </w:pPr>
+      <w:r>
+        <w:br w:type="page"/>
+      </w:r>
+    </w:p>
+    <w:p>
+      <w:pPr>
+        <w:pBdr>
+          <w:bottom w:val="single" w:color="000000" w:sz="6" w:space="2"/>
+        </w:pBdr>
+        <w:tabs>
+          <w:tab w:val="right" w:pos="8619"/>
+        </w:tabs>
+        <w:spacing w:after="120"/>
+      </w:pPr>
+      <w:r>
+        <w:rPr>
+          <w:rFonts w:ascii="Arial" w:eastAsia="游ゴシック" w:hint="eastAsia"/>
+          <w:b/>
+          <w:bCs/>
+          <w:sz w:val="28"/>
+          <w:szCs w:val="28"/>
+        </w:rPr>
+        <w:t xml:space="preserve">まなブリッジ算数 ストックリーディング　No.6</w:t>
+      </w:r>
+      <w:r>
+        <w:rPr>
+          <w:rFonts w:ascii="Arial" w:eastAsia="游ゴシック" w:hint="eastAsia"/>
+          <w:sz w:val="22"/>
+          <w:szCs w:val="22"/>
+        </w:rPr>
+        <w:t xml:space="preserve">	なまえ＿＿＿＿＿＿＿</w:t>
+      </w:r>
+    </w:p>
+    <w:tbl>
+      <w:tblPr>
+        <w:tblW w:type="dxa" w:w="8619"/>
+        <w:tblBorders>
+          <w:top w:val="single" w:color="auto" w:sz="4"/>
+          <w:left w:val="single" w:color="auto" w:sz="4"/>
+          <w:bottom w:val="single" w:color="auto" w:sz="4"/>
+          <w:right w:val="single" w:color="auto" w:sz="4"/>
+          <w:insideH w:val="single" w:color="auto" w:sz="4"/>
+          <w:insideV w:val="single" w:color="auto" w:sz="4"/>
+        </w:tblBorders>
+      </w:tblPr>
+      <w:tblGrid>
+        <w:gridCol w:w="8619"/>
+      </w:tblGrid>
+      <w:tr>
+        <w:trPr>
+          <w:trHeight w:val="5885" w:hRule="exact"/>
+        </w:trPr>
+        <w:tc>
+          <w:tcPr>
+            <w:tcW w:type="dxa" w:w="8619"/>
+            <w:tcBorders>
+              <w:top w:val="single" w:color="000000" w:sz="8"/>
+              <w:left w:val="single" w:color="000000" w:sz="8"/>
+              <w:bottom w:val="single" w:color="000000" w:sz="8"/>
+              <w:right w:val="single" w:color="000000" w:sz="8"/>
+            </w:tcBorders>
+            <w:tcMar>
+              <w:top w:type="dxa" w:w="100"/>
+              <w:left w:type="dxa" w:w="200"/>
+              <w:bottom w:type="dxa" w:w="100"/>
+              <w:right w:type="dxa" w:w="200"/>
+            </w:tcMar>
+          </w:tcPr>
+          <w:p>
+            <w:pPr>
+              <w:spacing w:after="120" w:before="60" w:line="360"/>
+            </w:pPr>
+            <w:r>
+              <w:rPr>
+                <w:rFonts w:ascii="Arial" w:eastAsia="游ゴシック" w:hint="eastAsia"/>
+                <w:b/>
+                <w:bCs/>
+                <w:sz w:val="34"/>
+                <w:szCs w:val="34"/>
+              </w:rPr>
+              <w:t xml:space="preserve">1</w:t>
+            </w:r>
+            <w:r>
+              <w:rPr>
+                <w:rFonts w:ascii="Arial" w:eastAsia="游ゴシック" w:hint="eastAsia"/>
+                <w:sz w:val="26"/>
+                <w:szCs w:val="26"/>
+              </w:rPr>
+              <w:t xml:space="preserve">　おんなのこが 1れつに ならんでいます。かおりさんの まえには 3にん、うしろには 4にん ならんでいます。おんなのこは なんにん ならんでいますか。</w:t>
+            </w:r>
+          </w:p>
+          <w:p>
+            <w:pPr>
+              <w:spacing w:after="0"/>
+            </w:pPr>
+            <w:r>
+              <w:rPr>
+                <w:rFonts w:ascii="Arial" w:eastAsia="游ゴシック" w:hint="eastAsia"/>
+                <w:sz w:val="26"/>
+                <w:szCs w:val="26"/>
+              </w:rPr>
+              <w:t xml:space="preserve"/>
+            </w:r>
+          </w:p>
+          <w:p>
+            <w:pPr>
+              <w:spacing w:after="200" w:before="200"/>
+            </w:pPr>
+            <w:r>
+              <w:rPr>
+                <w:rFonts w:ascii="Arial" w:eastAsia="游ゴシック" w:hint="eastAsia"/>
+                <w:sz w:val="26"/>
+                <w:szCs w:val="26"/>
+              </w:rPr>
+              <w:t xml:space="preserve">（しき）</w:t>
+            </w:r>
+          </w:p>
+          <w:p>
+            <w:pPr>
+              <w:spacing w:before="300"/>
+              <w:jc w:val="right"/>
+            </w:pPr>
+            <w:r>
+              <w:rPr>
+                <w:rFonts w:ascii="Arial" w:eastAsia="游ゴシック" w:hint="eastAsia"/>
+                <w:sz w:val="26"/>
+                <w:szCs w:val="26"/>
+              </w:rPr>
+              <w:t xml:space="preserve">こたえ</w:t>
+            </w:r>
+            <w:r>
+              <w:rPr>
+                <w:rFonts w:ascii="Arial" w:eastAsia="游ゴシック" w:hint="eastAsia"/>
+                <w:sz w:val="26"/>
+                <w:szCs w:val="26"/>
+              </w:rPr>
+              <w:t xml:space="preserve">＿＿＿＿＿＿＿＿＿＿＿</w:t>
+            </w:r>
+          </w:p>
+        </w:tc>
+      </w:tr>
+    </w:tbl>
+    <w:p>
+      <w:pPr>
+        <w:spacing w:after="0" w:line="120"/>
+      </w:pPr>
+    </w:p>
+    <w:tbl>
+      <w:tblPr>
+        <w:tblW w:type="dxa" w:w="8619"/>
+        <w:tblBorders>
+          <w:top w:val="single" w:color="auto" w:sz="4"/>
+          <w:left w:val="single" w:color="auto" w:sz="4"/>
+          <w:bottom w:val="single" w:color="auto" w:sz="4"/>
+          <w:right w:val="single" w:color="auto" w:sz="4"/>
+          <w:insideH w:val="single" w:color="auto" w:sz="4"/>
+          <w:insideV w:val="single" w:color="auto" w:sz="4"/>
+        </w:tblBorders>
+      </w:tblPr>
+      <w:tblGrid>
+        <w:gridCol w:w="8619"/>
+      </w:tblGrid>
+      <w:tr>
+        <w:trPr>
+          <w:trHeight w:val="5885" w:hRule="exact"/>
+        </w:trPr>
+        <w:tc>
+          <w:tcPr>
+            <w:tcW w:type="dxa" w:w="8619"/>
+            <w:tcBorders>
+              <w:top w:val="single" w:color="000000" w:sz="8"/>
+              <w:left w:val="single" w:color="000000" w:sz="8"/>
+              <w:bottom w:val="single" w:color="000000" w:sz="8"/>
+              <w:right w:val="single" w:color="000000" w:sz="8"/>
+            </w:tcBorders>
+            <w:tcMar>
+              <w:top w:type="dxa" w:w="100"/>
+              <w:left w:type="dxa" w:w="200"/>
+              <w:bottom w:type="dxa" w:w="100"/>
+              <w:right w:type="dxa" w:w="200"/>
+            </w:tcMar>
+          </w:tcPr>
+          <w:p>
+            <w:pPr>
+              <w:spacing w:after="120" w:before="60" w:line="360"/>
+            </w:pPr>
+            <w:r>
+              <w:rPr>
+                <w:rFonts w:ascii="Arial" w:eastAsia="游ゴシック" w:hint="eastAsia"/>
+                <w:b/>
+                <w:bCs/>
+                <w:sz w:val="34"/>
+                <w:szCs w:val="34"/>
+              </w:rPr>
+              <w:t xml:space="preserve">2</w:t>
+            </w:r>
+            <w:r>
+              <w:rPr>
+                <w:rFonts w:ascii="Arial" w:eastAsia="游ゴシック" w:hint="eastAsia"/>
+                <w:sz w:val="26"/>
+                <w:szCs w:val="26"/>
+              </w:rPr>
+              <w:t xml:space="preserve">　いちねんせいが いちれつに ならんでいます。たけしくんの まえには 4にん、うしろには 3にん ならんでいます。いちねんせいは なんにん ならんでいますか。</w:t>
+            </w:r>
+          </w:p>
+          <w:p>
+            <w:pPr>
+              <w:spacing w:after="0"/>
+            </w:pPr>
+            <w:r>
+              <w:rPr>
+                <w:rFonts w:ascii="Arial" w:eastAsia="游ゴシック" w:hint="eastAsia"/>
+                <w:sz w:val="26"/>
+                <w:szCs w:val="26"/>
+              </w:rPr>
+              <w:t xml:space="preserve"/>
+            </w:r>
+          </w:p>
+          <w:p>
+            <w:pPr>
+              <w:spacing w:after="200" w:before="200"/>
+            </w:pPr>
+            <w:r>
+              <w:rPr>
+                <w:rFonts w:ascii="Arial" w:eastAsia="游ゴシック" w:hint="eastAsia"/>
+                <w:sz w:val="26"/>
+                <w:szCs w:val="26"/>
+              </w:rPr>
+              <w:t xml:space="preserve">（しき）</w:t>
+            </w:r>
+          </w:p>
+          <w:p>
+            <w:pPr>
+              <w:spacing w:before="300"/>
+              <w:jc w:val="right"/>
+            </w:pPr>
+            <w:r>
+              <w:rPr>
+                <w:rFonts w:ascii="Arial" w:eastAsia="游ゴシック" w:hint="eastAsia"/>
+                <w:sz w:val="26"/>
+                <w:szCs w:val="26"/>
+              </w:rPr>
+              <w:t xml:space="preserve">こたえ</w:t>
+            </w:r>
+            <w:r>
+              <w:rPr>
+                <w:rFonts w:ascii="Arial" w:eastAsia="游ゴシック" w:hint="eastAsia"/>
+                <w:sz w:val="26"/>
+                <w:szCs w:val="26"/>
+              </w:rPr>
+              <w:t xml:space="preserve">＿＿＿＿＿＿＿＿＿＿＿</w:t>
+            </w:r>
+          </w:p>
+        </w:tc>
+      </w:tr>
+    </w:tbl>
+    <w:p>
+      <w:pPr>
+        <w:spacing w:after="0" w:line="20"/>
+      </w:pPr>
+      <w:r>
+        <w:br w:type="page"/>
+      </w:r>
+    </w:p>
+    <w:p>
+      <w:pPr>
+        <w:pBdr>
+          <w:bottom w:val="single" w:color="000000" w:sz="6" w:space="2"/>
+        </w:pBdr>
+        <w:tabs>
+          <w:tab w:val="right" w:pos="8619"/>
+        </w:tabs>
+        <w:spacing w:after="120"/>
+      </w:pPr>
+      <w:r>
+        <w:rPr>
+          <w:rFonts w:ascii="Arial" w:eastAsia="游ゴシック" w:hint="eastAsia"/>
+          <w:b/>
+          <w:bCs/>
+          <w:sz w:val="28"/>
+          <w:szCs w:val="28"/>
+        </w:rPr>
+        <w:t xml:space="preserve">まなブリッジ算数 ストックリーディング　No.7</w:t>
+      </w:r>
+      <w:r>
+        <w:rPr>
+          <w:rFonts w:ascii="Arial" w:eastAsia="游ゴシック" w:hint="eastAsia"/>
+          <w:sz w:val="22"/>
+          <w:szCs w:val="22"/>
+        </w:rPr>
+        <w:t xml:space="preserve">	なまえ＿＿＿＿＿＿＿</w:t>
+      </w:r>
+    </w:p>
+    <w:tbl>
+      <w:tblPr>
+        <w:tblW w:type="dxa" w:w="8619"/>
+        <w:tblBorders>
+          <w:top w:val="single" w:color="auto" w:sz="4"/>
+          <w:left w:val="single" w:color="auto" w:sz="4"/>
+          <w:bottom w:val="single" w:color="auto" w:sz="4"/>
+          <w:right w:val="single" w:color="auto" w:sz="4"/>
+          <w:insideH w:val="single" w:color="auto" w:sz="4"/>
+          <w:insideV w:val="single" w:color="auto" w:sz="4"/>
+        </w:tblBorders>
+      </w:tblPr>
+      <w:tblGrid>
+        <w:gridCol w:w="8619"/>
+      </w:tblGrid>
+      <w:tr>
+        <w:trPr>
+          <w:trHeight w:val="5885" w:hRule="exact"/>
+        </w:trPr>
+        <w:tc>
+          <w:tcPr>
+            <w:tcW w:type="dxa" w:w="8619"/>
+            <w:tcBorders>
+              <w:top w:val="single" w:color="000000" w:sz="8"/>
+              <w:left w:val="single" w:color="000000" w:sz="8"/>
+              <w:bottom w:val="single" w:color="000000" w:sz="8"/>
+              <w:right w:val="single" w:color="000000" w:sz="8"/>
+            </w:tcBorders>
+            <w:tcMar>
+              <w:top w:type="dxa" w:w="100"/>
+              <w:left w:type="dxa" w:w="200"/>
+              <w:bottom w:type="dxa" w:w="100"/>
+              <w:right w:type="dxa" w:w="200"/>
+            </w:tcMar>
+          </w:tcPr>
+          <w:p>
+            <w:pPr>
+              <w:spacing w:after="120" w:before="60" w:line="360"/>
+            </w:pPr>
+            <w:r>
+              <w:rPr>
+                <w:rFonts w:ascii="Arial" w:eastAsia="游ゴシック" w:hint="eastAsia"/>
+                <w:b/>
+                <w:bCs/>
+                <w:sz w:val="34"/>
+                <w:szCs w:val="34"/>
+              </w:rPr>
+              <w:t xml:space="preserve">3</w:t>
+            </w:r>
+            <w:r>
+              <w:rPr>
+                <w:rFonts w:ascii="Arial" w:eastAsia="游ゴシック" w:hint="eastAsia"/>
+                <w:sz w:val="26"/>
+                <w:szCs w:val="26"/>
+              </w:rPr>
+              <w:t xml:space="preserve">　こどもが よこ1れつに ならんでいます。としおくんの みぎには 4にん、ひだりにも 4にん います。こどもは なんにん ならんでいますか。</w:t>
+            </w:r>
+          </w:p>
+          <w:p>
+            <w:pPr>
+              <w:spacing w:after="0"/>
+            </w:pPr>
+            <w:r>
+              <w:rPr>
+                <w:rFonts w:ascii="Arial" w:eastAsia="游ゴシック" w:hint="eastAsia"/>
+                <w:sz w:val="26"/>
+                <w:szCs w:val="26"/>
+              </w:rPr>
+              <w:t xml:space="preserve"/>
+            </w:r>
+          </w:p>
+          <w:p>
+            <w:pPr>
+              <w:spacing w:after="200" w:before="200"/>
+            </w:pPr>
+            <w:r>
+              <w:rPr>
+                <w:rFonts w:ascii="Arial" w:eastAsia="游ゴシック" w:hint="eastAsia"/>
+                <w:sz w:val="26"/>
+                <w:szCs w:val="26"/>
+              </w:rPr>
+              <w:t xml:space="preserve">（しき）</w:t>
+            </w:r>
+          </w:p>
+          <w:p>
+            <w:pPr>
+              <w:spacing w:before="300"/>
+              <w:jc w:val="right"/>
+            </w:pPr>
+            <w:r>
+              <w:rPr>
+                <w:rFonts w:ascii="Arial" w:eastAsia="游ゴシック" w:hint="eastAsia"/>
+                <w:sz w:val="26"/>
+                <w:szCs w:val="26"/>
+              </w:rPr>
+              <w:t xml:space="preserve">こたえ</w:t>
+            </w:r>
+            <w:r>
+              <w:rPr>
+                <w:rFonts w:ascii="Arial" w:eastAsia="游ゴシック" w:hint="eastAsia"/>
+                <w:sz w:val="26"/>
+                <w:szCs w:val="26"/>
+              </w:rPr>
+              <w:t xml:space="preserve">＿＿＿＿＿＿＿＿＿＿＿</w:t>
+            </w:r>
+          </w:p>
+        </w:tc>
+      </w:tr>
+    </w:tbl>
+    <w:p>
+      <w:pPr>
+        <w:spacing w:after="0" w:line="120"/>
+      </w:pPr>
+    </w:p>
+    <w:tbl>
+      <w:tblPr>
+        <w:tblW w:type="dxa" w:w="8619"/>
+        <w:tblBorders>
+          <w:top w:val="single" w:color="auto" w:sz="4"/>
+          <w:left w:val="single" w:color="auto" w:sz="4"/>
+          <w:bottom w:val="single" w:color="auto" w:sz="4"/>
+          <w:right w:val="single" w:color="auto" w:sz="4"/>
+          <w:insideH w:val="single" w:color="auto" w:sz="4"/>
+          <w:insideV w:val="single" w:color="auto" w:sz="4"/>
+        </w:tblBorders>
+      </w:tblPr>
+      <w:tblGrid>
+        <w:gridCol w:w="8619"/>
+      </w:tblGrid>
+      <w:tr>
+        <w:trPr>
+          <w:trHeight w:val="5885" w:hRule="exact"/>
+        </w:trPr>
+        <w:tc>
+          <w:tcPr>
+            <w:tcW w:type="dxa" w:w="8619"/>
+            <w:tcBorders>
+              <w:top w:val="single" w:color="000000" w:sz="8"/>
+              <w:left w:val="single" w:color="000000" w:sz="8"/>
+              <w:bottom w:val="single" w:color="000000" w:sz="8"/>
+              <w:right w:val="single" w:color="000000" w:sz="8"/>
+            </w:tcBorders>
+            <w:tcMar>
+              <w:top w:type="dxa" w:w="100"/>
+              <w:left w:type="dxa" w:w="200"/>
+              <w:bottom w:type="dxa" w:w="100"/>
+              <w:right w:type="dxa" w:w="200"/>
+            </w:tcMar>
+          </w:tcPr>
+          <w:p>
+            <w:pPr>
+              <w:spacing w:after="120" w:before="60" w:line="360"/>
+            </w:pPr>
+            <w:r>
+              <w:rPr>
+                <w:rFonts w:ascii="Arial" w:eastAsia="游ゴシック" w:hint="eastAsia"/>
+                <w:b/>
+                <w:bCs/>
+                <w:sz w:val="34"/>
+                <w:szCs w:val="34"/>
+              </w:rPr>
+              <w:t xml:space="preserve">4</w:t>
+            </w:r>
+            <w:r>
+              <w:rPr>
+                <w:rFonts w:ascii="Arial" w:eastAsia="游ゴシック" w:hint="eastAsia"/>
+                <w:sz w:val="26"/>
+                <w:szCs w:val="26"/>
+              </w:rPr>
+              <w:t xml:space="preserve">　おはじきが 1れつに ならべてあります。くろい おはじきの みぎには 4こ、ひだりには 6こ しろい おはじきが あります。なんこ ならべてありますか。</w:t>
+            </w:r>
+          </w:p>
+          <w:p>
+            <w:pPr>
+              <w:spacing w:after="0"/>
+            </w:pPr>
+            <w:r>
+              <w:rPr>
+                <w:rFonts w:ascii="Arial" w:eastAsia="游ゴシック" w:hint="eastAsia"/>
+                <w:sz w:val="26"/>
+                <w:szCs w:val="26"/>
+              </w:rPr>
+              <w:t xml:space="preserve"/>
+            </w:r>
+          </w:p>
+          <w:p>
+            <w:pPr>
+              <w:spacing w:after="200" w:before="200"/>
+            </w:pPr>
+            <w:r>
+              <w:rPr>
+                <w:rFonts w:ascii="Arial" w:eastAsia="游ゴシック" w:hint="eastAsia"/>
+                <w:sz w:val="26"/>
+                <w:szCs w:val="26"/>
+              </w:rPr>
+              <w:t xml:space="preserve">（しき）</w:t>
+            </w:r>
+          </w:p>
+          <w:p>
+            <w:pPr>
+              <w:spacing w:before="300"/>
+              <w:jc w:val="right"/>
+            </w:pPr>
+            <w:r>
+              <w:rPr>
+                <w:rFonts w:ascii="Arial" w:eastAsia="游ゴシック" w:hint="eastAsia"/>
+                <w:sz w:val="26"/>
+                <w:szCs w:val="26"/>
+              </w:rPr>
+              <w:t xml:space="preserve">こたえ</w:t>
+            </w:r>
+            <w:r>
+              <w:rPr>
+                <w:rFonts w:ascii="Arial" w:eastAsia="游ゴシック" w:hint="eastAsia"/>
+                <w:sz w:val="26"/>
+                <w:szCs w:val="26"/>
+              </w:rPr>
+              <w:t xml:space="preserve">＿＿＿＿＿＿＿＿＿＿＿</w:t>
+            </w:r>
+          </w:p>
+        </w:tc>
+      </w:tr>
+    </w:tbl>
+    <w:p>
+      <w:pPr>
+        <w:spacing w:after="0" w:line="20"/>
+      </w:pPr>
+      <w:r>
+        <w:br w:type="page"/>
+      </w:r>
+    </w:p>
+    <w:p>
+      <w:pPr>
+        <w:pBdr>
+          <w:bottom w:val="single" w:color="000000" w:sz="6" w:space="2"/>
+        </w:pBdr>
+        <w:tabs>
+          <w:tab w:val="right" w:pos="8619"/>
+        </w:tabs>
+        <w:spacing w:after="120"/>
+      </w:pPr>
+      <w:r>
+        <w:rPr>
+          <w:rFonts w:ascii="Arial" w:eastAsia="游ゴシック" w:hint="eastAsia"/>
+          <w:b/>
+          <w:bCs/>
+          <w:sz w:val="28"/>
+          <w:szCs w:val="28"/>
+        </w:rPr>
+        <w:t xml:space="preserve">まなブリッジ算数 ストックリーディング　No.8</w:t>
+      </w:r>
+      <w:r>
+        <w:rPr>
+          <w:rFonts w:ascii="Arial" w:eastAsia="游ゴシック" w:hint="eastAsia"/>
+          <w:sz w:val="22"/>
+          <w:szCs w:val="22"/>
+        </w:rPr>
+        <w:t xml:space="preserve">	なまえ＿＿＿＿＿＿＿</w:t>
+      </w:r>
+    </w:p>
+    <w:tbl>
+      <w:tblPr>
+        <w:tblW w:type="dxa" w:w="8619"/>
+        <w:tblBorders>
+          <w:top w:val="single" w:color="auto" w:sz="4"/>
+          <w:left w:val="single" w:color="auto" w:sz="4"/>
+          <w:bottom w:val="single" w:color="auto" w:sz="4"/>
+          <w:right w:val="single" w:color="auto" w:sz="4"/>
+          <w:insideH w:val="single" w:color="auto" w:sz="4"/>
+          <w:insideV w:val="single" w:color="auto" w:sz="4"/>
+        </w:tblBorders>
+      </w:tblPr>
+      <w:tblGrid>
+        <w:gridCol w:w="8619"/>
+      </w:tblGrid>
+      <w:tr>
+        <w:trPr>
+          <w:trHeight w:val="5885" w:hRule="exact"/>
+        </w:trPr>
+        <w:tc>
+          <w:tcPr>
+            <w:tcW w:type="dxa" w:w="8619"/>
+            <w:tcBorders>
+              <w:top w:val="single" w:color="000000" w:sz="8"/>
+              <w:left w:val="single" w:color="000000" w:sz="8"/>
+              <w:bottom w:val="single" w:color="000000" w:sz="8"/>
+              <w:right w:val="single" w:color="000000" w:sz="8"/>
+            </w:tcBorders>
+            <w:tcMar>
+              <w:top w:type="dxa" w:w="100"/>
+              <w:left w:type="dxa" w:w="200"/>
+              <w:bottom w:type="dxa" w:w="100"/>
+              <w:right w:type="dxa" w:w="200"/>
+            </w:tcMar>
+          </w:tcPr>
+          <w:p>
+            <w:pPr>
+              <w:spacing w:after="120" w:before="60" w:line="360"/>
+            </w:pPr>
+            <w:r>
+              <w:rPr>
+                <w:rFonts w:ascii="Arial" w:eastAsia="游ゴシック" w:hint="eastAsia"/>
+                <w:b/>
+                <w:bCs/>
+                <w:sz w:val="34"/>
+                <w:szCs w:val="34"/>
+              </w:rPr>
+              <w:t xml:space="preserve">5</w:t>
+            </w:r>
+            <w:r>
+              <w:rPr>
+                <w:rFonts w:ascii="Arial" w:eastAsia="游ゴシック" w:hint="eastAsia"/>
+                <w:sz w:val="26"/>
+                <w:szCs w:val="26"/>
+              </w:rPr>
+              <w:t xml:space="preserve">　のりものが 1れつに ならんでいます。ひこうきの ひだりには ばすが 4だい、みぎには でんしゃが 5だい あります。のりものは なんだい ならんでいますか。</w:t>
+            </w:r>
+          </w:p>
+          <w:p>
+            <w:pPr>
+              <w:spacing w:after="0"/>
+            </w:pPr>
+            <w:r>
+              <w:rPr>
+                <w:rFonts w:ascii="Arial" w:eastAsia="游ゴシック" w:hint="eastAsia"/>
+                <w:sz w:val="26"/>
+                <w:szCs w:val="26"/>
+              </w:rPr>
+              <w:t xml:space="preserve"/>
+            </w:r>
+          </w:p>
+          <w:p>
+            <w:pPr>
+              <w:spacing w:after="200" w:before="200"/>
+            </w:pPr>
+            <w:r>
+              <w:rPr>
+                <w:rFonts w:ascii="Arial" w:eastAsia="游ゴシック" w:hint="eastAsia"/>
+                <w:sz w:val="26"/>
+                <w:szCs w:val="26"/>
+              </w:rPr>
+              <w:t xml:space="preserve">（しき）</w:t>
+            </w:r>
+          </w:p>
+          <w:p>
+            <w:pPr>
+              <w:spacing w:before="300"/>
+              <w:jc w:val="right"/>
+            </w:pPr>
+            <w:r>
+              <w:rPr>
+                <w:rFonts w:ascii="Arial" w:eastAsia="游ゴシック" w:hint="eastAsia"/>
+                <w:sz w:val="26"/>
+                <w:szCs w:val="26"/>
+              </w:rPr>
+              <w:t xml:space="preserve">こたえ</w:t>
+            </w:r>
+            <w:r>
+              <w:rPr>
+                <w:rFonts w:ascii="Arial" w:eastAsia="游ゴシック" w:hint="eastAsia"/>
+                <w:sz w:val="26"/>
+                <w:szCs w:val="26"/>
+              </w:rPr>
+              <w:t xml:space="preserve">＿＿＿＿＿＿＿＿＿＿＿</w:t>
+            </w:r>
+          </w:p>
+        </w:tc>
+      </w:tr>
+    </w:tbl>
+    <w:p>
+      <w:pPr>
+        <w:spacing w:after="0" w:line="120"/>
+      </w:pPr>
+    </w:p>
+    <w:tbl>
+      <w:tblPr>
+        <w:tblW w:type="dxa" w:w="8619"/>
+        <w:tblBorders>
+          <w:top w:val="single" w:color="auto" w:sz="4"/>
+          <w:left w:val="single" w:color="auto" w:sz="4"/>
+          <w:bottom w:val="single" w:color="auto" w:sz="4"/>
+          <w:right w:val="single" w:color="auto" w:sz="4"/>
+          <w:insideH w:val="single" w:color="auto" w:sz="4"/>
+          <w:insideV w:val="single" w:color="auto" w:sz="4"/>
+        </w:tblBorders>
+      </w:tblPr>
+      <w:tblGrid>
+        <w:gridCol w:w="8619"/>
+      </w:tblGrid>
+      <w:tr>
+        <w:trPr>
+          <w:trHeight w:val="5885" w:hRule="exact"/>
+        </w:trPr>
+        <w:tc>
+          <w:tcPr>
+            <w:tcW w:type="dxa" w:w="8619"/>
+            <w:tcBorders>
+              <w:top w:val="single" w:color="000000" w:sz="8"/>
+              <w:left w:val="single" w:color="000000" w:sz="8"/>
+              <w:bottom w:val="single" w:color="000000" w:sz="8"/>
+              <w:right w:val="single" w:color="000000" w:sz="8"/>
+            </w:tcBorders>
+            <w:tcMar>
+              <w:top w:type="dxa" w:w="100"/>
+              <w:left w:type="dxa" w:w="200"/>
+              <w:bottom w:type="dxa" w:w="100"/>
+              <w:right w:type="dxa" w:w="200"/>
+            </w:tcMar>
+          </w:tcPr>
+          <w:p>
+            <w:pPr>
+              <w:spacing w:after="120" w:before="60" w:line="360"/>
+            </w:pPr>
+            <w:r>
+              <w:rPr>
+                <w:rFonts w:ascii="Arial" w:eastAsia="游ゴシック" w:hint="eastAsia"/>
+                <w:b/>
+                <w:bCs/>
+                <w:sz w:val="34"/>
+                <w:szCs w:val="34"/>
+              </w:rPr>
+              <w:t xml:space="preserve">6</w:t>
+            </w:r>
+            <w:r>
+              <w:rPr>
+                <w:rFonts w:ascii="Arial" w:eastAsia="游ゴシック" w:hint="eastAsia"/>
+                <w:sz w:val="26"/>
+                <w:szCs w:val="26"/>
+              </w:rPr>
+              <w:t xml:space="preserve">　こどもが 1れつに ならんでいます。ともみさんの まえにも うしろにも 5にん ならんでいます。こどもは なんにん ならんでいますか。</w:t>
+            </w:r>
+          </w:p>
+          <w:p>
+            <w:pPr>
+              <w:spacing w:after="0"/>
+            </w:pPr>
+            <w:r>
+              <w:rPr>
+                <w:rFonts w:ascii="Arial" w:eastAsia="游ゴシック" w:hint="eastAsia"/>
+                <w:sz w:val="26"/>
+                <w:szCs w:val="26"/>
+              </w:rPr>
+              <w:t xml:space="preserve"/>
+            </w:r>
+          </w:p>
+          <w:p>
+            <w:pPr>
+              <w:spacing w:after="200" w:before="200"/>
+            </w:pPr>
+            <w:r>
+              <w:rPr>
+                <w:rFonts w:ascii="Arial" w:eastAsia="游ゴシック" w:hint="eastAsia"/>
+                <w:sz w:val="26"/>
+                <w:szCs w:val="26"/>
+              </w:rPr>
+              <w:t xml:space="preserve">（しき）</w:t>
+            </w:r>
+          </w:p>
+          <w:p>
+            <w:pPr>
+              <w:spacing w:before="300"/>
+              <w:jc w:val="right"/>
+            </w:pPr>
+            <w:r>
+              <w:rPr>
+                <w:rFonts w:ascii="Arial" w:eastAsia="游ゴシック" w:hint="eastAsia"/>
+                <w:sz w:val="26"/>
+                <w:szCs w:val="26"/>
+              </w:rPr>
+              <w:t xml:space="preserve">こたえ</w:t>
+            </w:r>
+            <w:r>
+              <w:rPr>
+                <w:rFonts w:ascii="Arial" w:eastAsia="游ゴシック" w:hint="eastAsia"/>
+                <w:sz w:val="26"/>
+                <w:szCs w:val="26"/>
+              </w:rPr>
+              <w:t xml:space="preserve">＿＿＿＿＿＿＿＿＿＿＿</w:t>
+            </w:r>
+          </w:p>
+        </w:tc>
+      </w:tr>
+    </w:tbl>
+    <w:p>
+      <w:pPr>
+        <w:spacing w:after="0" w:line="20"/>
+      </w:pPr>
+      <w:r>
+        <w:br w:type="page"/>
+      </w:r>
+    </w:p>
+    <w:p>
+      <w:pPr>
+        <w:pBdr>
+          <w:bottom w:val="single" w:color="000000" w:sz="6" w:space="2"/>
+        </w:pBdr>
+        <w:tabs>
+          <w:tab w:val="right" w:pos="8619"/>
+        </w:tabs>
+        <w:spacing w:after="120"/>
+      </w:pPr>
+      <w:r>
+        <w:rPr>
+          <w:rFonts w:ascii="Arial" w:eastAsia="游ゴシック" w:hint="eastAsia"/>
+          <w:b/>
+          <w:bCs/>
+          <w:sz w:val="28"/>
+          <w:szCs w:val="28"/>
+        </w:rPr>
+        <w:t xml:space="preserve">まなブリッジ算数 ストックリーディング　No.9</w:t>
+      </w:r>
+      <w:r>
+        <w:rPr>
+          <w:rFonts w:ascii="Arial" w:eastAsia="游ゴシック" w:hint="eastAsia"/>
+          <w:sz w:val="22"/>
+          <w:szCs w:val="22"/>
+        </w:rPr>
+        <w:t xml:space="preserve">	なまえ＿＿＿＿＿＿＿</w:t>
+      </w:r>
+    </w:p>
+    <w:tbl>
+      <w:tblPr>
+        <w:tblW w:type="dxa" w:w="8619"/>
+        <w:tblBorders>
+          <w:top w:val="single" w:color="auto" w:sz="4"/>
+          <w:left w:val="single" w:color="auto" w:sz="4"/>
+          <w:bottom w:val="single" w:color="auto" w:sz="4"/>
+          <w:right w:val="single" w:color="auto" w:sz="4"/>
+          <w:insideH w:val="single" w:color="auto" w:sz="4"/>
+          <w:insideV w:val="single" w:color="auto" w:sz="4"/>
+        </w:tblBorders>
+      </w:tblPr>
+      <w:tblGrid>
+        <w:gridCol w:w="8619"/>
+      </w:tblGrid>
+      <w:tr>
+        <w:trPr>
+          <w:trHeight w:val="5885" w:hRule="exact"/>
+        </w:trPr>
+        <w:tc>
+          <w:tcPr>
+            <w:tcW w:type="dxa" w:w="8619"/>
+            <w:tcBorders>
+              <w:top w:val="single" w:color="000000" w:sz="8"/>
+              <w:left w:val="single" w:color="000000" w:sz="8"/>
+              <w:bottom w:val="single" w:color="000000" w:sz="8"/>
+              <w:right w:val="single" w:color="000000" w:sz="8"/>
+            </w:tcBorders>
+            <w:tcMar>
+              <w:top w:type="dxa" w:w="100"/>
+              <w:left w:type="dxa" w:w="200"/>
+              <w:bottom w:type="dxa" w:w="100"/>
+              <w:right w:type="dxa" w:w="200"/>
+            </w:tcMar>
+          </w:tcPr>
+          <w:p>
+            <w:pPr>
+              <w:spacing w:after="120" w:before="60" w:line="360"/>
+            </w:pPr>
+            <w:r>
+              <w:rPr>
+                <w:rFonts w:ascii="Arial" w:eastAsia="游ゴシック" w:hint="eastAsia"/>
+                <w:b/>
+                <w:bCs/>
+                <w:sz w:val="34"/>
+                <w:szCs w:val="34"/>
+              </w:rPr>
+              <w:t xml:space="preserve">7</w:t>
+            </w:r>
+            <w:r>
+              <w:rPr>
+                <w:rFonts w:ascii="Arial" w:eastAsia="游ゴシック" w:hint="eastAsia"/>
+                <w:sz w:val="26"/>
+                <w:szCs w:val="26"/>
+              </w:rPr>
+              <w:t xml:space="preserve">　えれべーたーに ひとが のっています。2かいで ふたり おりて、4にん のってきたので、6にんに なりました。2かいに つくまでに なんにん のっていましたか。</w:t>
+            </w:r>
+          </w:p>
+          <w:p>
+            <w:pPr>
+              <w:spacing w:after="0"/>
+            </w:pPr>
+            <w:r>
+              <w:rPr>
+                <w:rFonts w:ascii="Arial" w:eastAsia="游ゴシック" w:hint="eastAsia"/>
+                <w:sz w:val="26"/>
+                <w:szCs w:val="26"/>
+              </w:rPr>
+              <w:t xml:space="preserve"/>
+            </w:r>
+          </w:p>
+          <w:p>
+            <w:pPr>
+              <w:spacing w:after="200" w:before="200"/>
+            </w:pPr>
+            <w:r>
+              <w:rPr>
+                <w:rFonts w:ascii="Arial" w:eastAsia="游ゴシック" w:hint="eastAsia"/>
+                <w:sz w:val="26"/>
+                <w:szCs w:val="26"/>
+              </w:rPr>
+              <w:t xml:space="preserve">（しき）</w:t>
+            </w:r>
+          </w:p>
+          <w:p>
+            <w:pPr>
+              <w:spacing w:before="300"/>
+              <w:jc w:val="right"/>
+            </w:pPr>
+            <w:r>
+              <w:rPr>
+                <w:rFonts w:ascii="Arial" w:eastAsia="游ゴシック" w:hint="eastAsia"/>
+                <w:sz w:val="26"/>
+                <w:szCs w:val="26"/>
+              </w:rPr>
+              <w:t xml:space="preserve">こたえ</w:t>
+            </w:r>
+            <w:r>
+              <w:rPr>
+                <w:rFonts w:ascii="Arial" w:eastAsia="游ゴシック" w:hint="eastAsia"/>
+                <w:sz w:val="26"/>
+                <w:szCs w:val="26"/>
+              </w:rPr>
+              <w:t xml:space="preserve">＿＿＿＿＿＿＿＿＿＿＿</w:t>
+            </w:r>
+          </w:p>
+        </w:tc>
+      </w:tr>
+    </w:tbl>
+    <w:p>
+      <w:pPr>
+        <w:spacing w:after="0" w:line="120"/>
+      </w:pPr>
+    </w:p>
+    <w:tbl>
+      <w:tblPr>
+        <w:tblW w:type="dxa" w:w="8619"/>
+        <w:tblBorders>
+          <w:top w:val="single" w:color="auto" w:sz="4"/>
+          <w:left w:val="single" w:color="auto" w:sz="4"/>
+          <w:bottom w:val="single" w:color="auto" w:sz="4"/>
+          <w:right w:val="single" w:color="auto" w:sz="4"/>
+          <w:insideH w:val="single" w:color="auto" w:sz="4"/>
+          <w:insideV w:val="single" w:color="auto" w:sz="4"/>
+        </w:tblBorders>
+      </w:tblPr>
+      <w:tblGrid>
+        <w:gridCol w:w="8619"/>
+      </w:tblGrid>
+      <w:tr>
+        <w:trPr>
+          <w:trHeight w:val="5885" w:hRule="exact"/>
+        </w:trPr>
+        <w:tc>
+          <w:tcPr>
+            <w:tcW w:type="dxa" w:w="8619"/>
+            <w:tcBorders>
+              <w:top w:val="single" w:color="000000" w:sz="8"/>
+              <w:left w:val="single" w:color="000000" w:sz="8"/>
+              <w:bottom w:val="single" w:color="000000" w:sz="8"/>
+              <w:right w:val="single" w:color="000000" w:sz="8"/>
+            </w:tcBorders>
+            <w:tcMar>
+              <w:top w:type="dxa" w:w="100"/>
+              <w:left w:type="dxa" w:w="200"/>
+              <w:bottom w:type="dxa" w:w="100"/>
+              <w:right w:type="dxa" w:w="200"/>
+            </w:tcMar>
+          </w:tcPr>
+          <w:p>
+            <w:pPr>
+              <w:spacing w:after="120" w:before="60" w:line="360"/>
+            </w:pPr>
+            <w:r>
+              <w:rPr>
+                <w:rFonts w:ascii="Arial" w:eastAsia="游ゴシック" w:hint="eastAsia"/>
+                <w:b/>
+                <w:bCs/>
+                <w:sz w:val="34"/>
+                <w:szCs w:val="34"/>
+              </w:rPr>
+              <w:t xml:space="preserve">8</w:t>
+            </w:r>
+            <w:r>
+              <w:rPr>
+                <w:rFonts w:ascii="Arial" w:eastAsia="游ゴシック" w:hint="eastAsia"/>
+                <w:sz w:val="26"/>
+                <w:szCs w:val="26"/>
+              </w:rPr>
+              <w:t xml:space="preserve">　えんぴつが あります。きのう 2ほん、きょう 3ぼん つかったので、また 7ほん かってきたら、えんぴつの かずは 8ほんに なりました。おとといえんぴつは なんぼん ありましたか。</w:t>
+            </w:r>
+          </w:p>
+          <w:p>
+            <w:pPr>
+              <w:spacing w:after="0"/>
+            </w:pPr>
+            <w:r>
+              <w:rPr>
+                <w:rFonts w:ascii="Arial" w:eastAsia="游ゴシック" w:hint="eastAsia"/>
+                <w:sz w:val="26"/>
+                <w:szCs w:val="26"/>
+              </w:rPr>
+              <w:t xml:space="preserve"/>
+            </w:r>
+          </w:p>
+          <w:p>
+            <w:pPr>
+              <w:spacing w:after="200" w:before="200"/>
+            </w:pPr>
+            <w:r>
+              <w:rPr>
+                <w:rFonts w:ascii="Arial" w:eastAsia="游ゴシック" w:hint="eastAsia"/>
+                <w:sz w:val="26"/>
+                <w:szCs w:val="26"/>
+              </w:rPr>
+              <w:t xml:space="preserve">（しき）</w:t>
+            </w:r>
+          </w:p>
+          <w:p>
+            <w:pPr>
+              <w:spacing w:before="300"/>
+              <w:jc w:val="right"/>
+            </w:pPr>
+            <w:r>
+              <w:rPr>
+                <w:rFonts w:ascii="Arial" w:eastAsia="游ゴシック" w:hint="eastAsia"/>
+                <w:sz w:val="26"/>
+                <w:szCs w:val="26"/>
+              </w:rPr>
+              <w:t xml:space="preserve">こたえ</w:t>
+            </w:r>
+            <w:r>
+              <w:rPr>
+                <w:rFonts w:ascii="Arial" w:eastAsia="游ゴシック" w:hint="eastAsia"/>
+                <w:sz w:val="26"/>
+                <w:szCs w:val="26"/>
+              </w:rPr>
+              <w:t xml:space="preserve">＿＿＿＿＿＿＿＿＿＿＿</w:t>
+            </w:r>
+          </w:p>
+        </w:tc>
+      </w:tr>
+    </w:tbl>
+    <w:p>
+      <w:pPr>
+        <w:spacing w:after="0" w:line="20"/>
+      </w:pPr>
+      <w:r>
+        <w:br w:type="page"/>
+      </w:r>
+    </w:p>
+    <w:p>
+      <w:pPr>
+        <w:pBdr>
+          <w:bottom w:val="single" w:color="000000" w:sz="6" w:space="2"/>
+        </w:pBdr>
+        <w:tabs>
+          <w:tab w:val="right" w:pos="8619"/>
+        </w:tabs>
+        <w:spacing w:after="120"/>
+      </w:pPr>
+      <w:r>
+        <w:rPr>
+          <w:rFonts w:ascii="Arial" w:eastAsia="游ゴシック" w:hint="eastAsia"/>
+          <w:b/>
+          <w:bCs/>
+          <w:sz w:val="28"/>
+          <w:szCs w:val="28"/>
+        </w:rPr>
+        <w:t xml:space="preserve">まなブリッジ算数 ストックリーディング　No.10</w:t>
+      </w:r>
+      <w:r>
+        <w:rPr>
+          <w:rFonts w:ascii="Arial" w:eastAsia="游ゴシック" w:hint="eastAsia"/>
+          <w:sz w:val="22"/>
+          <w:szCs w:val="22"/>
+        </w:rPr>
+        <w:t xml:space="preserve">	なまえ＿＿＿＿＿＿＿</w:t>
+      </w:r>
+    </w:p>
+    <w:tbl>
+      <w:tblPr>
+        <w:tblW w:type="dxa" w:w="8619"/>
+        <w:tblBorders>
+          <w:top w:val="single" w:color="auto" w:sz="4"/>
+          <w:left w:val="single" w:color="auto" w:sz="4"/>
+          <w:bottom w:val="single" w:color="auto" w:sz="4"/>
+          <w:right w:val="single" w:color="auto" w:sz="4"/>
+          <w:insideH w:val="single" w:color="auto" w:sz="4"/>
+          <w:insideV w:val="single" w:color="auto" w:sz="4"/>
+        </w:tblBorders>
+      </w:tblPr>
+      <w:tblGrid>
+        <w:gridCol w:w="8619"/>
+      </w:tblGrid>
+      <w:tr>
+        <w:trPr>
+          <w:trHeight w:val="5885" w:hRule="exact"/>
+        </w:trPr>
+        <w:tc>
+          <w:tcPr>
+            <w:tcW w:type="dxa" w:w="8619"/>
+            <w:tcBorders>
+              <w:top w:val="single" w:color="000000" w:sz="8"/>
+              <w:left w:val="single" w:color="000000" w:sz="8"/>
+              <w:bottom w:val="single" w:color="000000" w:sz="8"/>
+              <w:right w:val="single" w:color="000000" w:sz="8"/>
+            </w:tcBorders>
+            <w:tcMar>
+              <w:top w:type="dxa" w:w="100"/>
+              <w:left w:type="dxa" w:w="200"/>
+              <w:bottom w:type="dxa" w:w="100"/>
+              <w:right w:type="dxa" w:w="200"/>
+            </w:tcMar>
+          </w:tcPr>
+          <w:p>
+            <w:pPr>
+              <w:spacing w:after="120" w:before="60" w:line="360"/>
+            </w:pPr>
+            <w:r>
+              <w:rPr>
+                <w:rFonts w:ascii="Arial" w:eastAsia="游ゴシック" w:hint="eastAsia"/>
+                <w:b/>
+                <w:bCs/>
+                <w:sz w:val="34"/>
+                <w:szCs w:val="34"/>
+              </w:rPr>
+              <w:t xml:space="preserve">9</w:t>
+            </w:r>
+            <w:r>
+              <w:rPr>
+                <w:rFonts w:ascii="Arial" w:eastAsia="游ゴシック" w:hint="eastAsia"/>
+                <w:sz w:val="26"/>
+                <w:szCs w:val="26"/>
+              </w:rPr>
+              <w:t xml:space="preserve">　みかんを 40こ もらいました。きょう、また 8こ もらったので、6こ たべました。みかんは きのうより なんこ ふえましたか。</w:t>
+            </w:r>
+          </w:p>
+          <w:p>
+            <w:pPr>
+              <w:spacing w:after="0"/>
+            </w:pPr>
+            <w:r>
+              <w:rPr>
+                <w:rFonts w:ascii="Arial" w:eastAsia="游ゴシック" w:hint="eastAsia"/>
+                <w:sz w:val="26"/>
+                <w:szCs w:val="26"/>
+              </w:rPr>
+              <w:t xml:space="preserve"/>
+            </w:r>
+          </w:p>
+          <w:p>
+            <w:pPr>
+              <w:spacing w:after="200" w:before="200"/>
+            </w:pPr>
+            <w:r>
+              <w:rPr>
+                <w:rFonts w:ascii="Arial" w:eastAsia="游ゴシック" w:hint="eastAsia"/>
+                <w:sz w:val="26"/>
+                <w:szCs w:val="26"/>
+              </w:rPr>
+              <w:t xml:space="preserve">（しき）</w:t>
+            </w:r>
+          </w:p>
+          <w:p>
+            <w:pPr>
+              <w:spacing w:before="300"/>
+              <w:jc w:val="right"/>
+            </w:pPr>
+            <w:r>
+              <w:rPr>
+                <w:rFonts w:ascii="Arial" w:eastAsia="游ゴシック" w:hint="eastAsia"/>
+                <w:sz w:val="26"/>
+                <w:szCs w:val="26"/>
+              </w:rPr>
+              <w:t xml:space="preserve">こたえ</w:t>
+            </w:r>
+            <w:r>
+              <w:rPr>
+                <w:rFonts w:ascii="Arial" w:eastAsia="游ゴシック" w:hint="eastAsia"/>
+                <w:sz w:val="26"/>
+                <w:szCs w:val="26"/>
+              </w:rPr>
+              <w:t xml:space="preserve">＿＿＿＿＿＿＿＿＿＿＿</w:t>
+            </w:r>
+          </w:p>
+        </w:tc>
+      </w:tr>
+    </w:tbl>
+    <w:p>
+      <w:pPr>
+        <w:spacing w:after="0" w:line="120"/>
+      </w:pPr>
+    </w:p>
+    <w:tbl>
+      <w:tblPr>
+        <w:tblW w:type="dxa" w:w="8619"/>
+        <w:tblBorders>
+          <w:top w:val="single" w:color="auto" w:sz="4"/>
+          <w:left w:val="single" w:color="auto" w:sz="4"/>
+          <w:bottom w:val="single" w:color="auto" w:sz="4"/>
+          <w:right w:val="single" w:color="auto" w:sz="4"/>
+          <w:insideH w:val="single" w:color="auto" w:sz="4"/>
+          <w:insideV w:val="single" w:color="auto" w:sz="4"/>
+        </w:tblBorders>
+      </w:tblPr>
+      <w:tblGrid>
+        <w:gridCol w:w="8619"/>
+      </w:tblGrid>
+      <w:tr>
+        <w:trPr>
+          <w:trHeight w:val="5885" w:hRule="exact"/>
+        </w:trPr>
+        <w:tc>
+          <w:tcPr>
+            <w:tcW w:type="dxa" w:w="8619"/>
+            <w:tcBorders>
+              <w:top w:val="single" w:color="000000" w:sz="8"/>
+              <w:left w:val="single" w:color="000000" w:sz="8"/>
+              <w:bottom w:val="single" w:color="000000" w:sz="8"/>
+              <w:right w:val="single" w:color="000000" w:sz="8"/>
+            </w:tcBorders>
+            <w:tcMar>
+              <w:top w:type="dxa" w:w="100"/>
+              <w:left w:type="dxa" w:w="200"/>
+              <w:bottom w:type="dxa" w:w="100"/>
+              <w:right w:type="dxa" w:w="200"/>
+            </w:tcMar>
+          </w:tcPr>
+          <w:p>
+            <w:pPr>
+              <w:spacing w:after="120" w:before="60" w:line="360"/>
+            </w:pPr>
+            <w:r>
+              <w:rPr>
+                <w:rFonts w:ascii="Arial" w:eastAsia="游ゴシック" w:hint="eastAsia"/>
+                <w:b/>
+                <w:bCs/>
+                <w:sz w:val="34"/>
+                <w:szCs w:val="34"/>
+              </w:rPr>
+              <w:t xml:space="preserve">10</w:t>
+            </w:r>
+            <w:r>
+              <w:rPr>
+                <w:rFonts w:ascii="Arial" w:eastAsia="游ゴシック" w:hint="eastAsia"/>
+                <w:sz w:val="26"/>
+                <w:szCs w:val="26"/>
+              </w:rPr>
+              <w:t xml:space="preserve">　せいとが あそんでいます。9にん きたのですが、ふたり かえりました。こどもは さっきより なんにん ふえましたか。</w:t>
+            </w:r>
+          </w:p>
+          <w:p>
+            <w:pPr>
+              <w:spacing w:after="0"/>
+            </w:pPr>
+            <w:r>
+              <w:rPr>
+                <w:rFonts w:ascii="Arial" w:eastAsia="游ゴシック" w:hint="eastAsia"/>
+                <w:sz w:val="26"/>
+                <w:szCs w:val="26"/>
+              </w:rPr>
+              <w:t xml:space="preserve"/>
             </w:r>
           </w:p>
           <w:p>

</xml_diff>

<commit_message>
Redraw line-diagram problems in hand-drawn segment style
Co-Authored-By: Claude Sonnet 5.5 <noreply@anthropic.com>
Claude-Session: https://claude.ai/code/session_01NWqM3V7aFwEEd31dwpfsy5
</commit_message>
<xml_diff>
--- a/まなブリッジ算数_ストックリーディング.docx
+++ b/まなブリッジ算数_ストックリーディング.docx
@@ -1219,7 +1219,7 @@
             <w:r>
               <w:drawing>
                 <wp:inline distT="0" distB="0" distL="0" distR="0">
-                  <wp:extent cx="4953000" cy="2038350"/>
+                  <wp:extent cx="4953000" cy="1666875"/>
                   <wp:effectExtent t="0" r="0" b="0" l="0"/>
                   <wp:docPr id="1" name="f7.png" descr="問題の図" title="図"/>
                   <wp:cNvGraphicFramePr>
@@ -1244,7 +1244,7 @@
                         <pic:spPr bwMode="auto">
                           <a:xfrm>
                             <a:off x="0" y="0"/>
-                            <a:ext cx="4953000" cy="2038350"/>
+                            <a:ext cx="4953000" cy="1666875"/>
                           </a:xfrm>
                           <a:prstGeom prst="rect">
                             <a:avLst/>
@@ -1390,7 +1390,7 @@
             <w:r>
               <w:drawing>
                 <wp:inline distT="0" distB="0" distL="0" distR="0">
-                  <wp:extent cx="4953000" cy="1676400"/>
+                  <wp:extent cx="4953000" cy="1695450"/>
                   <wp:effectExtent t="0" r="0" b="0" l="0"/>
                   <wp:docPr id="1" name="f8.png" descr="問題の図" title="図"/>
                   <wp:cNvGraphicFramePr>
@@ -1415,7 +1415,7 @@
                         <pic:spPr bwMode="auto">
                           <a:xfrm>
                             <a:off x="0" y="0"/>
-                            <a:ext cx="4953000" cy="1676400"/>
+                            <a:ext cx="4953000" cy="1695450"/>
                           </a:xfrm>
                           <a:prstGeom prst="rect">
                             <a:avLst/>

</xml_diff>